<commit_message>
fix(templates): the first aid decision sets each person's role off with commas
The preamble and Art. 1 read "X, în calitate de …" and "X, având funcția de
… în cadrul …, pentru sediul…", and the record "în cadrul …, cu ocazia
instruirii".

Claude-Session: https://claude.ai/code/session_01A9qjCHVH6kcDAEKFiJoShR
</commit_message>
<xml_diff>
--- a/packages/document-engine/templates/1.3_decision_first_aid.docx
+++ b/packages/document-engine/templates/1.3_decision_first_aid.docx
@@ -113,7 +113,7 @@
           <w:szCs w:val="20"/>
           <w:lang w:val="ro-RO"/>
         </w:rPr>
-        <w:t>ent.representativeName}} în calitate de {{client.representativeRole}} în cadrul {{client.legalName}}</w:t>
+        <w:t xml:space="preserve">ent.representativeName}}, în calitate de {{client.representativeRole}} în cadrul {{client.legalName}}</w:t>
       </w:r>
       <w:r>
         <w:rPr>
@@ -254,7 +254,7 @@
           <w:szCs w:val="20"/>
           <w:lang w:val="ro-RO"/>
         </w:rPr>
-        <w:t>{{name}} având funcția de {{jobTitle}} în cadrul {{client.legalName}}</w:t>
+        <w:t xml:space="preserve">{{name}}, având funcția de {{jobTitle}} în cadrul {{client.legalName}},</w:t>
       </w:r>
       <w:r>
         <w:rPr>
@@ -1405,7 +1405,7 @@
           <w:szCs w:val="20"/>
           <w:lang w:val="ro-RO"/>
         </w:rPr>
-        <w:t xml:space="preserve">Încheiat azi {{issueDate}}, în cadrul {{client.legalName}} cu ocazia instruirii suplimentare a personalului desemnat să acorde primul ajutor: {{firstAiderNames}}.</w:t>
+        <w:t xml:space="preserve">Încheiat azi {{issueDate}}, în cadrul {{client.legalName}}, cu ocazia instruirii suplimentare a personalului desemnat să acorde primul ajutor: {{firstAiderNames}}.</w:t>
       </w:r>
     </w:p>
     <w:p>

</xml_diff>